<commit_message>
deal screen: update neo.docx
</commit_message>
<xml_diff>
--- a/hub/static/research/companies/neo.docx
+++ b/hub/static/research/companies/neo.docx
@@ -77,7 +77,7 @@
           <w:color w:val="1A1A1A"/>
           <w:sz w:val="32"/>
         </w:rPr>
-        <w:t>2.7 / 4.0</w:t>
+        <w:t>0.0 / 4.0</w:t>
       </w:r>
       <w:r>
         <w:rPr>
@@ -87,7 +87,7 @@
           <w:color w:val="828282"/>
           <w:sz w:val="21"/>
         </w:rPr>
-        <w:t xml:space="preserve">   (raw 2.7)</w:t>
+        <w:t xml:space="preserve">   (raw 0.0)</w:t>
       </w:r>
       <w:r>
         <w:rPr>
@@ -97,7 +97,7 @@
           <w:color w:val="828282"/>
           <w:sz w:val="21"/>
         </w:rPr>
-        <w:t xml:space="preserve">   —   WATCH LIST — OUTSIDE MANDATE (STAGE)</w:t>
+        <w:t xml:space="preserve">   —   SCORING FAILED — NOT SCREENED</w:t>
       </w:r>
     </w:p>
     <w:tbl>
@@ -185,618 +185,6 @@
           </w:p>
         </w:tc>
       </w:tr>
-      <w:tr>
-        <w:tc>
-          <w:tcPr>
-            <w:tcW w:type="dxa" w:w="2664"/>
-            <w:shd w:val="clear" w:color="auto" w:fill="F5F5F5"/>
-            <w:tcMar>
-              <w:top w:w="40" w:type="dxa"/>
-              <w:bottom w:w="40" w:type="dxa"/>
-              <w:left w:w="60" w:type="dxa"/>
-              <w:right w:w="60" w:type="dxa"/>
-            </w:tcMar>
-            <w:tcBorders>
-              <w:top w:val="nil"/>
-              <w:left w:val="nil"/>
-              <w:right w:val="nil"/>
-              <w:bottom w:val="single" w:sz="4" w:color="E4DFD5"/>
-            </w:tcBorders>
-          </w:tcPr>
-          <w:p>
-            <w:r>
-              <w:rPr>
-                <w:rFonts w:ascii="Sora" w:hAnsi="Sora"/>
-                <w:b w:val="0"/>
-                <w:caps w:val="0"/>
-                <w:color w:val="1A1A1A"/>
-                <w:sz w:val="19"/>
-              </w:rPr>
-              <w:t>Lead / Round Dynamics</w:t>
-            </w:r>
-          </w:p>
-        </w:tc>
-        <w:tc>
-          <w:tcPr>
-            <w:tcW w:type="dxa" w:w="792"/>
-            <w:shd w:val="clear" w:color="auto" w:fill="F5F5F5"/>
-            <w:tcMar>
-              <w:top w:w="40" w:type="dxa"/>
-              <w:bottom w:w="40" w:type="dxa"/>
-              <w:left w:w="60" w:type="dxa"/>
-              <w:right w:w="60" w:type="dxa"/>
-            </w:tcMar>
-            <w:tcBorders>
-              <w:top w:val="nil"/>
-              <w:left w:val="nil"/>
-              <w:right w:val="nil"/>
-              <w:bottom w:val="single" w:sz="4" w:color="E4DFD5"/>
-            </w:tcBorders>
-          </w:tcPr>
-          <w:p>
-            <w:r>
-              <w:rPr>
-                <w:rFonts w:ascii="Sora" w:hAnsi="Sora"/>
-                <w:b/>
-                <w:caps w:val="0"/>
-                <w:color w:val="1A1A1A"/>
-                <w:sz w:val="19"/>
-              </w:rPr>
-              <w:t>3.1</w:t>
-            </w:r>
-            <w:r>
-              <w:rPr>
-                <w:rFonts w:ascii="Sora" w:hAnsi="Sora"/>
-                <w:b w:val="0"/>
-                <w:caps w:val="0"/>
-                <w:color w:val="828282"/>
-                <w:sz w:val="17"/>
-              </w:rPr>
-              <w:t xml:space="preserve"> / 4</w:t>
-            </w:r>
-          </w:p>
-        </w:tc>
-        <w:tc>
-          <w:tcPr>
-            <w:tcW w:type="dxa" w:w="5904"/>
-            <w:shd w:val="clear" w:color="auto" w:fill="F5F5F5"/>
-            <w:tcMar>
-              <w:top w:w="40" w:type="dxa"/>
-              <w:bottom w:w="40" w:type="dxa"/>
-              <w:left w:w="60" w:type="dxa"/>
-              <w:right w:w="60" w:type="dxa"/>
-            </w:tcMar>
-            <w:tcBorders>
-              <w:top w:val="nil"/>
-              <w:left w:val="nil"/>
-              <w:right w:val="nil"/>
-              <w:bottom w:val="single" w:sz="4" w:color="E4DFD5"/>
-            </w:tcBorders>
-          </w:tcPr>
-          <w:p>
-            <w:r>
-              <w:rPr>
-                <w:rFonts w:ascii="Sora" w:hAnsi="Sora"/>
-                <w:b w:val="0"/>
-                <w:caps w:val="0"/>
-                <w:color w:val="3C3C3C"/>
-                <w:sz w:val="18"/>
-              </w:rPr>
-              <w:t>Tier1+ new-money co-lead plus strong follow-on participation create excellent institutional signal, though Series A stage keeps round outside ID8’s current deployment mandate.[3][4][11]</w:t>
-            </w:r>
-          </w:p>
-        </w:tc>
-      </w:tr>
-      <w:tr>
-        <w:tc>
-          <w:tcPr>
-            <w:tcW w:type="dxa" w:w="2664"/>
-            <w:shd w:val="clear" w:color="auto" w:fill="FFFFFF"/>
-            <w:tcMar>
-              <w:top w:w="40" w:type="dxa"/>
-              <w:bottom w:w="40" w:type="dxa"/>
-              <w:left w:w="60" w:type="dxa"/>
-              <w:right w:w="60" w:type="dxa"/>
-            </w:tcMar>
-            <w:tcBorders>
-              <w:top w:val="nil"/>
-              <w:left w:val="nil"/>
-              <w:right w:val="nil"/>
-              <w:bottom w:val="single" w:sz="4" w:color="E4DFD5"/>
-            </w:tcBorders>
-          </w:tcPr>
-          <w:p>
-            <w:r>
-              <w:rPr>
-                <w:rFonts w:ascii="Sora" w:hAnsi="Sora"/>
-                <w:b w:val="0"/>
-                <w:caps w:val="0"/>
-                <w:color w:val="1A1A1A"/>
-                <w:sz w:val="19"/>
-              </w:rPr>
-              <w:t>Founder / Team Quality</w:t>
-            </w:r>
-          </w:p>
-        </w:tc>
-        <w:tc>
-          <w:tcPr>
-            <w:tcW w:type="dxa" w:w="792"/>
-            <w:shd w:val="clear" w:color="auto" w:fill="FFFFFF"/>
-            <w:tcMar>
-              <w:top w:w="40" w:type="dxa"/>
-              <w:bottom w:w="40" w:type="dxa"/>
-              <w:left w:w="60" w:type="dxa"/>
-              <w:right w:w="60" w:type="dxa"/>
-            </w:tcMar>
-            <w:tcBorders>
-              <w:top w:val="nil"/>
-              <w:left w:val="nil"/>
-              <w:right w:val="nil"/>
-              <w:bottom w:val="single" w:sz="4" w:color="E4DFD5"/>
-            </w:tcBorders>
-          </w:tcPr>
-          <w:p>
-            <w:r>
-              <w:rPr>
-                <w:rFonts w:ascii="Sora" w:hAnsi="Sora"/>
-                <w:b/>
-                <w:caps w:val="0"/>
-                <w:color w:val="1A1A1A"/>
-                <w:sz w:val="19"/>
-              </w:rPr>
-              <w:t>3.0</w:t>
-            </w:r>
-            <w:r>
-              <w:rPr>
-                <w:rFonts w:ascii="Sora" w:hAnsi="Sora"/>
-                <w:b w:val="0"/>
-                <w:caps w:val="0"/>
-                <w:color w:val="828282"/>
-                <w:sz w:val="17"/>
-              </w:rPr>
-              <w:t xml:space="preserve"> / 4</w:t>
-            </w:r>
-          </w:p>
-        </w:tc>
-        <w:tc>
-          <w:tcPr>
-            <w:tcW w:type="dxa" w:w="5904"/>
-            <w:shd w:val="clear" w:color="auto" w:fill="FFFFFF"/>
-            <w:tcMar>
-              <w:top w:w="40" w:type="dxa"/>
-              <w:bottom w:w="40" w:type="dxa"/>
-              <w:left w:w="60" w:type="dxa"/>
-              <w:right w:w="60" w:type="dxa"/>
-            </w:tcMar>
-            <w:tcBorders>
-              <w:top w:val="nil"/>
-              <w:left w:val="nil"/>
-              <w:right w:val="nil"/>
-              <w:bottom w:val="single" w:sz="4" w:color="E4DFD5"/>
-            </w:tcBorders>
-          </w:tcPr>
-          <w:p>
-            <w:r>
-              <w:rPr>
-                <w:rFonts w:ascii="Sora" w:hAnsi="Sora"/>
-                <w:b w:val="0"/>
-                <w:caps w:val="0"/>
-                <w:color w:val="3C3C3C"/>
-                <w:sz w:val="18"/>
-              </w:rPr>
-              <w:t>Former SentinelOne leaders provide strong cybersecurity domain expertise and credible leadership, but limited data on hiring momentum leaves some execution risk unanswered.[3][6][9]</w:t>
-            </w:r>
-          </w:p>
-        </w:tc>
-      </w:tr>
-      <w:tr>
-        <w:tc>
-          <w:tcPr>
-            <w:tcW w:type="dxa" w:w="2664"/>
-            <w:shd w:val="clear" w:color="auto" w:fill="F5F5F5"/>
-            <w:tcMar>
-              <w:top w:w="40" w:type="dxa"/>
-              <w:bottom w:w="40" w:type="dxa"/>
-              <w:left w:w="60" w:type="dxa"/>
-              <w:right w:w="60" w:type="dxa"/>
-            </w:tcMar>
-            <w:tcBorders>
-              <w:top w:val="nil"/>
-              <w:left w:val="nil"/>
-              <w:right w:val="nil"/>
-              <w:bottom w:val="single" w:sz="4" w:color="E4DFD5"/>
-            </w:tcBorders>
-          </w:tcPr>
-          <w:p>
-            <w:r>
-              <w:rPr>
-                <w:rFonts w:ascii="Sora" w:hAnsi="Sora"/>
-                <w:b w:val="0"/>
-                <w:caps w:val="0"/>
-                <w:color w:val="1A1A1A"/>
-                <w:sz w:val="19"/>
-              </w:rPr>
-              <w:t>AI Score</w:t>
-            </w:r>
-          </w:p>
-        </w:tc>
-        <w:tc>
-          <w:tcPr>
-            <w:tcW w:type="dxa" w:w="792"/>
-            <w:shd w:val="clear" w:color="auto" w:fill="F5F5F5"/>
-            <w:tcMar>
-              <w:top w:w="40" w:type="dxa"/>
-              <w:bottom w:w="40" w:type="dxa"/>
-              <w:left w:w="60" w:type="dxa"/>
-              <w:right w:w="60" w:type="dxa"/>
-            </w:tcMar>
-            <w:tcBorders>
-              <w:top w:val="nil"/>
-              <w:left w:val="nil"/>
-              <w:right w:val="nil"/>
-              <w:bottom w:val="single" w:sz="4" w:color="E4DFD5"/>
-            </w:tcBorders>
-          </w:tcPr>
-          <w:p>
-            <w:r>
-              <w:rPr>
-                <w:rFonts w:ascii="Sora" w:hAnsi="Sora"/>
-                <w:b/>
-                <w:caps w:val="0"/>
-                <w:color w:val="1A1A1A"/>
-                <w:sz w:val="19"/>
-              </w:rPr>
-              <w:t>2.5</w:t>
-            </w:r>
-            <w:r>
-              <w:rPr>
-                <w:rFonts w:ascii="Sora" w:hAnsi="Sora"/>
-                <w:b w:val="0"/>
-                <w:caps w:val="0"/>
-                <w:color w:val="828282"/>
-                <w:sz w:val="17"/>
-              </w:rPr>
-              <w:t xml:space="preserve"> / 4</w:t>
-            </w:r>
-          </w:p>
-        </w:tc>
-        <w:tc>
-          <w:tcPr>
-            <w:tcW w:type="dxa" w:w="5904"/>
-            <w:shd w:val="clear" w:color="auto" w:fill="F5F5F5"/>
-            <w:tcMar>
-              <w:top w:w="40" w:type="dxa"/>
-              <w:bottom w:w="40" w:type="dxa"/>
-              <w:left w:w="60" w:type="dxa"/>
-              <w:right w:w="60" w:type="dxa"/>
-            </w:tcMar>
-            <w:tcBorders>
-              <w:top w:val="nil"/>
-              <w:left w:val="nil"/>
-              <w:right w:val="nil"/>
-              <w:bottom w:val="single" w:sz="4" w:color="E4DFD5"/>
-            </w:tcBorders>
-          </w:tcPr>
-          <w:p>
-            <w:r>
-              <w:rPr>
-                <w:rFonts w:ascii="Sora" w:hAnsi="Sora"/>
-                <w:b w:val="0"/>
-                <w:caps w:val="0"/>
-                <w:color w:val="3C3C3C"/>
-                <w:sz w:val="18"/>
-              </w:rPr>
-              <w:t>Neo’s product squarely targets AI agent governance and security, implying meaningful AI-driven moat even though proprietary model ownership and training pipeline are not yet documented publicly.[4][6]</w:t>
-            </w:r>
-          </w:p>
-        </w:tc>
-      </w:tr>
-      <w:tr>
-        <w:tc>
-          <w:tcPr>
-            <w:tcW w:type="dxa" w:w="2664"/>
-            <w:shd w:val="clear" w:color="auto" w:fill="FFFFFF"/>
-            <w:tcMar>
-              <w:top w:w="40" w:type="dxa"/>
-              <w:bottom w:w="40" w:type="dxa"/>
-              <w:left w:w="60" w:type="dxa"/>
-              <w:right w:w="60" w:type="dxa"/>
-            </w:tcMar>
-            <w:tcBorders>
-              <w:top w:val="nil"/>
-              <w:left w:val="nil"/>
-              <w:right w:val="nil"/>
-              <w:bottom w:val="single" w:sz="4" w:color="E4DFD5"/>
-            </w:tcBorders>
-          </w:tcPr>
-          <w:p>
-            <w:r>
-              <w:rPr>
-                <w:rFonts w:ascii="Sora" w:hAnsi="Sora"/>
-                <w:b w:val="0"/>
-                <w:caps w:val="0"/>
-                <w:color w:val="1A1A1A"/>
-                <w:sz w:val="19"/>
-              </w:rPr>
-              <w:t>Terms</w:t>
-            </w:r>
-          </w:p>
-        </w:tc>
-        <w:tc>
-          <w:tcPr>
-            <w:tcW w:type="dxa" w:w="792"/>
-            <w:shd w:val="clear" w:color="auto" w:fill="FFFFFF"/>
-            <w:tcMar>
-              <w:top w:w="40" w:type="dxa"/>
-              <w:bottom w:w="40" w:type="dxa"/>
-              <w:left w:w="60" w:type="dxa"/>
-              <w:right w:w="60" w:type="dxa"/>
-            </w:tcMar>
-            <w:tcBorders>
-              <w:top w:val="nil"/>
-              <w:left w:val="nil"/>
-              <w:right w:val="nil"/>
-              <w:bottom w:val="single" w:sz="4" w:color="E4DFD5"/>
-            </w:tcBorders>
-          </w:tcPr>
-          <w:p>
-            <w:r>
-              <w:rPr>
-                <w:rFonts w:ascii="Sora" w:hAnsi="Sora"/>
-                <w:b/>
-                <w:caps w:val="0"/>
-                <w:color w:val="1A1A1A"/>
-                <w:sz w:val="19"/>
-              </w:rPr>
-              <w:t>3.0</w:t>
-            </w:r>
-            <w:r>
-              <w:rPr>
-                <w:rFonts w:ascii="Sora" w:hAnsi="Sora"/>
-                <w:b w:val="0"/>
-                <w:caps w:val="0"/>
-                <w:color w:val="828282"/>
-                <w:sz w:val="17"/>
-              </w:rPr>
-              <w:t xml:space="preserve"> / 4</w:t>
-            </w:r>
-          </w:p>
-        </w:tc>
-        <w:tc>
-          <w:tcPr>
-            <w:tcW w:type="dxa" w:w="5904"/>
-            <w:shd w:val="clear" w:color="auto" w:fill="FFFFFF"/>
-            <w:tcMar>
-              <w:top w:w="40" w:type="dxa"/>
-              <w:bottom w:w="40" w:type="dxa"/>
-              <w:left w:w="60" w:type="dxa"/>
-              <w:right w:w="60" w:type="dxa"/>
-            </w:tcMar>
-            <w:tcBorders>
-              <w:top w:val="nil"/>
-              <w:left w:val="nil"/>
-              <w:right w:val="nil"/>
-              <w:bottom w:val="single" w:sz="4" w:color="E4DFD5"/>
-            </w:tcBorders>
-          </w:tcPr>
-          <w:p>
-            <w:r>
-              <w:rPr>
-                <w:rFonts w:ascii="Sora" w:hAnsi="Sora"/>
-                <w:b w:val="0"/>
-                <w:caps w:val="0"/>
-                <w:color w:val="3C3C3C"/>
-                <w:sz w:val="18"/>
-              </w:rPr>
-              <w:t>Series A appears to be a standard VC-led equity round with no public indications of unusual fees, carry, or complex SPV layering.[3][4]</w:t>
-            </w:r>
-          </w:p>
-        </w:tc>
-      </w:tr>
-      <w:tr>
-        <w:tc>
-          <w:tcPr>
-            <w:tcW w:type="dxa" w:w="2664"/>
-            <w:shd w:val="clear" w:color="auto" w:fill="F5F5F5"/>
-            <w:tcMar>
-              <w:top w:w="40" w:type="dxa"/>
-              <w:bottom w:w="40" w:type="dxa"/>
-              <w:left w:w="60" w:type="dxa"/>
-              <w:right w:w="60" w:type="dxa"/>
-            </w:tcMar>
-            <w:tcBorders>
-              <w:top w:val="nil"/>
-              <w:left w:val="nil"/>
-              <w:right w:val="nil"/>
-              <w:bottom w:val="single" w:sz="4" w:color="E4DFD5"/>
-            </w:tcBorders>
-          </w:tcPr>
-          <w:p>
-            <w:r>
-              <w:rPr>
-                <w:rFonts w:ascii="Sora" w:hAnsi="Sora"/>
-                <w:b w:val="0"/>
-                <w:caps w:val="0"/>
-                <w:color w:val="1A1A1A"/>
-                <w:sz w:val="19"/>
-              </w:rPr>
-              <w:t>Fundamentals</w:t>
-            </w:r>
-          </w:p>
-        </w:tc>
-        <w:tc>
-          <w:tcPr>
-            <w:tcW w:type="dxa" w:w="792"/>
-            <w:shd w:val="clear" w:color="auto" w:fill="F5F5F5"/>
-            <w:tcMar>
-              <w:top w:w="40" w:type="dxa"/>
-              <w:bottom w:w="40" w:type="dxa"/>
-              <w:left w:w="60" w:type="dxa"/>
-              <w:right w:w="60" w:type="dxa"/>
-            </w:tcMar>
-            <w:tcBorders>
-              <w:top w:val="nil"/>
-              <w:left w:val="nil"/>
-              <w:right w:val="nil"/>
-              <w:bottom w:val="single" w:sz="4" w:color="E4DFD5"/>
-            </w:tcBorders>
-          </w:tcPr>
-          <w:p>
-            <w:r>
-              <w:rPr>
-                <w:rFonts w:ascii="Sora" w:hAnsi="Sora"/>
-                <w:b/>
-                <w:caps w:val="0"/>
-                <w:color w:val="1A1A1A"/>
-                <w:sz w:val="19"/>
-              </w:rPr>
-              <w:t>2.4</w:t>
-            </w:r>
-            <w:r>
-              <w:rPr>
-                <w:rFonts w:ascii="Sora" w:hAnsi="Sora"/>
-                <w:b w:val="0"/>
-                <w:caps w:val="0"/>
-                <w:color w:val="828282"/>
-                <w:sz w:val="17"/>
-              </w:rPr>
-              <w:t xml:space="preserve"> / 4</w:t>
-            </w:r>
-          </w:p>
-        </w:tc>
-        <w:tc>
-          <w:tcPr>
-            <w:tcW w:type="dxa" w:w="5904"/>
-            <w:shd w:val="clear" w:color="auto" w:fill="F5F5F5"/>
-            <w:tcMar>
-              <w:top w:w="40" w:type="dxa"/>
-              <w:bottom w:w="40" w:type="dxa"/>
-              <w:left w:w="60" w:type="dxa"/>
-              <w:right w:w="60" w:type="dxa"/>
-            </w:tcMar>
-            <w:tcBorders>
-              <w:top w:val="nil"/>
-              <w:left w:val="nil"/>
-              <w:right w:val="nil"/>
-              <w:bottom w:val="single" w:sz="4" w:color="E4DFD5"/>
-            </w:tcBorders>
-          </w:tcPr>
-          <w:p>
-            <w:r>
-              <w:rPr>
-                <w:rFonts w:ascii="Sora" w:hAnsi="Sora"/>
-                <w:b w:val="0"/>
-                <w:caps w:val="0"/>
-                <w:color w:val="3C3C3C"/>
-                <w:sz w:val="18"/>
-              </w:rPr>
-              <w:t>Financial metrics remain undisclosed, but Neo targets a large enterprise AI security market with emerging moat around agentic endpoint protection, suggesting upside once traction is proven.[3][4][6]</w:t>
-            </w:r>
-          </w:p>
-        </w:tc>
-      </w:tr>
-      <w:tr>
-        <w:tc>
-          <w:tcPr>
-            <w:tcW w:type="dxa" w:w="2664"/>
-            <w:shd w:val="clear" w:color="auto" w:fill="FFFFFF"/>
-            <w:tcMar>
-              <w:top w:w="40" w:type="dxa"/>
-              <w:bottom w:w="40" w:type="dxa"/>
-              <w:left w:w="60" w:type="dxa"/>
-              <w:right w:w="60" w:type="dxa"/>
-            </w:tcMar>
-            <w:tcBorders>
-              <w:top w:val="nil"/>
-              <w:left w:val="nil"/>
-              <w:right w:val="nil"/>
-              <w:bottom w:val="single" w:sz="4" w:color="E4DFD5"/>
-            </w:tcBorders>
-          </w:tcPr>
-          <w:p>
-            <w:r>
-              <w:rPr>
-                <w:rFonts w:ascii="Sora" w:hAnsi="Sora"/>
-                <w:b w:val="0"/>
-                <w:caps w:val="0"/>
-                <w:color w:val="1A1A1A"/>
-                <w:sz w:val="19"/>
-              </w:rPr>
-              <w:t>Return Potential</w:t>
-            </w:r>
-          </w:p>
-        </w:tc>
-        <w:tc>
-          <w:tcPr>
-            <w:tcW w:type="dxa" w:w="792"/>
-            <w:shd w:val="clear" w:color="auto" w:fill="FFFFFF"/>
-            <w:tcMar>
-              <w:top w:w="40" w:type="dxa"/>
-              <w:bottom w:w="40" w:type="dxa"/>
-              <w:left w:w="60" w:type="dxa"/>
-              <w:right w:w="60" w:type="dxa"/>
-            </w:tcMar>
-            <w:tcBorders>
-              <w:top w:val="nil"/>
-              <w:left w:val="nil"/>
-              <w:right w:val="nil"/>
-              <w:bottom w:val="single" w:sz="4" w:color="E4DFD5"/>
-            </w:tcBorders>
-          </w:tcPr>
-          <w:p>
-            <w:r>
-              <w:rPr>
-                <w:rFonts w:ascii="Sora" w:hAnsi="Sora"/>
-                <w:b/>
-                <w:caps w:val="0"/>
-                <w:color w:val="1A1A1A"/>
-                <w:sz w:val="19"/>
-              </w:rPr>
-              <w:t>2.4</w:t>
-            </w:r>
-            <w:r>
-              <w:rPr>
-                <w:rFonts w:ascii="Sora" w:hAnsi="Sora"/>
-                <w:b w:val="0"/>
-                <w:caps w:val="0"/>
-                <w:color w:val="828282"/>
-                <w:sz w:val="17"/>
-              </w:rPr>
-              <w:t xml:space="preserve"> / 4</w:t>
-            </w:r>
-          </w:p>
-        </w:tc>
-        <w:tc>
-          <w:tcPr>
-            <w:tcW w:type="dxa" w:w="5904"/>
-            <w:shd w:val="clear" w:color="auto" w:fill="FFFFFF"/>
-            <w:tcMar>
-              <w:top w:w="40" w:type="dxa"/>
-              <w:bottom w:w="40" w:type="dxa"/>
-              <w:left w:w="60" w:type="dxa"/>
-              <w:right w:w="60" w:type="dxa"/>
-            </w:tcMar>
-            <w:tcBorders>
-              <w:top w:val="nil"/>
-              <w:left w:val="nil"/>
-              <w:right w:val="nil"/>
-              <w:bottom w:val="single" w:sz="4" w:color="E4DFD5"/>
-            </w:tcBorders>
-          </w:tcPr>
-          <w:p>
-            <w:r>
-              <w:rPr>
-                <w:rFonts w:ascii="Sora" w:hAnsi="Sora"/>
-                <w:b w:val="0"/>
-                <w:caps w:val="0"/>
-                <w:color w:val="3C3C3C"/>
-                <w:sz w:val="18"/>
-              </w:rPr>
-              <w:t>Tier1 leads and a new category in AI security imply attractive potential returns, though absent valuation data keeps MOIC and IRR modeling preliminary at this stage.[3][4][6]</w:t>
-            </w:r>
-          </w:p>
-        </w:tc>
-      </w:tr>
     </w:tbl>
     <w:p>
       <w:pPr>
@@ -834,7 +222,7 @@
           <w:color w:val="1A1A1A"/>
           <w:sz w:val="21"/>
         </w:rPr>
-        <w:t>Neo Security aligns strongly with ID8’s AI thesis, securing agentic software at the endpoint with new-money Tier1 co-lead Bessemer and re-upping Tier1 lead Andreessen Horowitz.[3][4][6][11] Because this is a Series A round, outside the fund’s Series B+ mandate, Neo should be tracked on the watch list for reevaluation once later-stage traction emerges.[3][11]</w:t>
+        <w:t>scoring failed: 401 Client Error: Unauthorized for url: https://api.perplexity.ai/chat/completions</w:t>
       </w:r>
     </w:p>
     <w:p>
@@ -849,7 +237,7 @@
           <w:color w:val="828282"/>
           <w:sz w:val="18"/>
         </w:rPr>
-        <w:t>Confidence: medium</w:t>
+        <w:t>Confidence: low</w:t>
       </w:r>
     </w:p>
     <w:sectPr>

</xml_diff>